<commit_message>
Remove legacy demo tickets and align specification counts
</commit_message>
<xml_diff>
--- a/outputs/technical_spec_wms_ai_assistant_v1.2.docx
+++ b/outputs/technical_spec_wms_ai_assistant_v1.2.docx
@@ -1119,6 +1119,20 @@
           <w:color w:val="172033"/>
           <w:sz w:val="22"/>
         </w:rPr>
+        <w:t>Всего 530 обезличенных тестовых заявок.</w:t>
+      </w:r>
+    </w:p>
+    <w:p>
+      <w:pPr>
+        <w:pStyle w:val="ListBullet"/>
+        <w:spacing w:after="80" w:line="280" w:lineRule="auto"/>
+      </w:pPr>
+      <w:r>
+        <w:rPr>
+          <w:rFonts w:ascii="Calibri" w:hAnsi="Calibri"/>
+          <w:color w:val="172033"/>
+          <w:sz w:val="22"/>
+        </w:rPr>
         <w:t>500 WMS-обращений с ключами WMS-*.</w:t>
       </w:r>
     </w:p>

</xml_diff>